<commit_message>
Update speaker bios for Hao Zhong, Khurram Ismail, Stacy Rasgon; keep earlier titles
Co-Authored-By: Claude Sonnet 5.5 <noreply@anthropic.com>
Claude-Session: https://claude.ai/code/session_019oJDv4rKDWjT19L1cRtiMR
</commit_message>
<xml_diff>
--- a/CASPA_嘉宾简介_官网版.docx
+++ b/CASPA_嘉宾简介_官网版.docx
@@ -815,9 +815,7 @@
     </w:p>
     <w:p>
       <w:r>
-        <w:t>Hao Zhong is Co-founder and CEO of ScaleFlux, a pioneer in storage and memory infrastructure that builds silicon, firmware, software, and module solutions for the AI data pipeline. Zhong has more than 20 years of experience in the field, from architecting the industry's first LDPC read channel chip at LSI to leading SSD controller development at SandForce and Fusion-io, and has been recognized by Goldman Sachs as one of its Most Exceptional Entrepreneurs. Zhong co-</w:t>
-        <w:lastRenderedPageBreak/>
-        <w:t>founded ScaleFlux in 2014. Zhong holds a Ph.D. in Electrical Engineering from Rensselaer Polytechnic Institute.</w:t>
+        <w:t>Hao Zhong is Co-founder and CEO of ScaleFlux, a pioneer in storage and memory infrastructure building silicon, firmware, software, and module solutions for the AI data pipeline. A technology pioneer with more than 20 years of engineering experience, Zhong previously designed the industry’s first LDPC read channel chip at LSI and led SSD controller development and innovation at SandForce and Fusion-io. He has been recognized by Goldman Sachs as one of its Most Exceptional Entrepreneurs.</w:t>
       </w:r>
     </w:p>
     <w:p>
@@ -833,7 +831,7 @@
           <w:sz w:val="18"/>
           <w:lang w:eastAsia="zh-CN"/>
         </w:rPr>
-        <w:t xml:space="preserve">出处：领英（LinkedIn）个人主页 https://www.linkedin.com/in/hao-zhong-scaleflux/</w:t>
+        <w:t>出处：公司官网 https://scaleflux.com/leadership/</w:t>
       </w:r>
     </w:p>
     <w:p>
@@ -960,7 +958,7 @@
     </w:p>
     <w:p>
       <w:r>
-        <w:t>Khurram Ismail is Chief Product Officer at Sandisk, leading product and engineering across consumer, client, gaming, automotive, and data center markets. With more than 25 years of experience in semiconductors and storage, Ismail previously served as Senior Vice President of the Flash Products Group at Western Digital, responsible for enterprise, client, mobile, and retail storage products, and as Vice President of Client SSD Engineering. Earlier, Ismail held applications and test engineering roles at Micron Technology for 12 years. Ismail holds a B.S. in Electrical Engineering from Northern Arizona University and an MBA from the University of Phoenix.</w:t>
+        <w:t>Khurram Ismail is Chief Product Officer at Sandisk, where he leads engineering and product management across consumer, client, gaming, automotive, and data center markets. With more than 25 years of experience in semiconductors spanning engineering and business management, he previously held engineering and management roles of increasing responsibility at Western Digital, Sandisk, and Micron, with experience in client and embedded product development, applications engineering, and product and test engineering. He holds a degree in electrical engineering from Northern Arizona University and is actively involved in charitable organizations focused on reducing food insecurity among children and teens.</w:t>
       </w:r>
     </w:p>
     <w:p>
@@ -976,7 +974,7 @@
           <w:sz w:val="18"/>
           <w:lang w:eastAsia="zh-CN"/>
         </w:rPr>
-        <w:t xml:space="preserve">出处：领英（LinkedIn）个人主页 https://www.linkedin.com/in/khurramismail/</w:t>
+        <w:t>出处：公司官网 https://www.sandisk.com/company/about-us</w:t>
       </w:r>
     </w:p>
     <w:p>
@@ -1355,7 +1353,7 @@
     </w:p>
     <w:p>
       <w:r>
-        <w:t>Stacy Rasgon is Managing Director and Senior Analyst covering U.S. Semiconductors and Semiconductor Capital Equipment at Bernstein Research, where Rasgon has led coverage since 2008. Rasgon has been ranked among the top semiconductor analysts in the Institutional Investor All-America Research Team Survey for 16 consecutive years, including numerous #1 rankings. Before joining Bernstein, Rasgon was an Engagement Manager at McKinsey &amp; Company, advising semiconductor companies across the value chain. Rasgon holds a Ph.D. in Chemical Engineering from MIT, where Rasgon was an NSF Graduate Research Fellow, and a B.S. in Chemical Engineering from UCLA.</w:t>
+        <w:t>Stacy A. Rasgon, Ph.D., is Managing Director and Senior Analyst at Bernstein covering U.S. Semiconductors, a role he has held since joining the firm in April 2008. Before Bernstein, he was a management consultant at McKinsey &amp; Company, advising semiconductor clients across three continents on strategy, operations, and M&amp;A, and worked at IBM’s T.J. Watson Research Center on plasma etch processes for semiconductor devices. He has been ranked among the top analysts in his field by Institutional Investor every year since 2010, including multiple #1 rankings in U.S. semiconductors. Rasgon holds a Ph.D. in Chemical Engineering from MIT, a Certificate in Financial Technology from MIT Sloan, and a B.S. in Chemical Engineering from UCLA, where he graduated summa cum laude.</w:t>
       </w:r>
     </w:p>
     <w:p>
@@ -1371,7 +1369,7 @@
           <w:sz w:val="18"/>
           <w:lang w:eastAsia="zh-CN"/>
         </w:rPr>
-        <w:t xml:space="preserve">出处：领英（LinkedIn）个人主页 https://www.linkedin.com/in/stacy-rasgon-6924963/</w:t>
+        <w:t>出处：公司官网 https://www.bernsteinresearch.com/research/</w:t>
       </w:r>
     </w:p>
     <w:p>

</xml_diff>